<commit_message>
Fix the four failed test cases
- Edit request approval: SeniorEditRequest::senior() now uses the
  senior_citizen_id column, so Head approvals apply the changes.
- One-time grants: a senior cannot receive the same one-time grant twice
  under a different period label (failed attempts can be retried).
- Reports: Admin drafts reports, Head approves, Admin publishes, stored
  in the existing analytics_reports table instead of sample data.
- Chat: attachment, photo, and emoji buttons now work; messages can carry
  a file up to 5 MB, and deleting a conversation removes its files.

Co-Authored-By: Claude Opus 5.5 <noreply@anthropic.com>
Claude-Session: https://claude.ai/code/session_01Y19ujJrkyUjbsHgfVEVtQn
</commit_message>
<xml_diff>
--- a/docs/Bulan_SeniorCare_Test_Cases.docx
+++ b/docs/Bulan_SeniorCare_Test_Cases.docx
@@ -224,7 +224,7 @@
                 <w:sz w:val="20"/>
                 <w:szCs w:val="20"/>
               </w:rPr>
-              <w:t xml:space="preserve">Claude Code (automated API run + source code review)</w:t>
+              <w:t xml:space="preserve">Claude Code (automated API run, source code review, and browser re-test of fixes)</w:t>
             </w:r>
           </w:p>
         </w:tc>
@@ -7932,7 +7932,7 @@
                 <w:sz w:val="19"/>
                 <w:szCs w:val="19"/>
               </w:rPr>
-              <w:t xml:space="preserve">API: FAILED. Approval refused (HTTP 422) – "This senior record no longer exists and cannot be approved." even though the senior exists; changes were not applied. Cause: SeniorEditRequest::senior() looks up "senior_id" but the column is "senior_citizen_id" (app/Models/SeniorEditRequest.php). Head's request list also shows no senior details.</w:t>
+              <w:t xml:space="preserve">Re-test after fix: Head approved (HTTP 200); the senior's name changed to the requested value and the request shows the senior's details. Originally failed – the edit request looked up its senior with the wrong column; fixed in app/Models/SeniorEditRequest.php.</w:t>
             </w:r>
           </w:p>
         </w:tc>
@@ -7945,7 +7945,7 @@
               <w:bottom w:val="single" w:color="9AA5B1" w:sz="4"/>
               <w:right w:val="single" w:color="9AA5B1" w:sz="4"/>
             </w:tcBorders>
-            <w:shd w:fill="F8D7DA" w:color="auto" w:val="clear"/>
+            <w:shd w:fill="E2F0D9" w:color="auto" w:val="clear"/>
             <w:tcMar>
               <w:top w:type="dxa" w:w="70"/>
               <w:left w:type="dxa" w:w="100"/>
@@ -7963,11 +7963,11 @@
                 <w:rFonts w:ascii="Calibri" w:cs="Calibri" w:eastAsia="Calibri" w:hAnsi="Calibri"/>
                 <w:b/>
                 <w:bCs/>
-                <w:color w:val="9C1C28"/>
-                <w:sz w:val="19"/>
-                <w:szCs w:val="19"/>
-              </w:rPr>
-              <w:t xml:space="preserve">Fail</w:t>
+                <w:color w:val="2E6B1F"/>
+                <w:sz w:val="19"/>
+                <w:szCs w:val="19"/>
+              </w:rPr>
+              <w:t xml:space="preserve">Pass</w:t>
             </w:r>
           </w:p>
         </w:tc>
@@ -9646,7 +9646,7 @@
                 <w:sz w:val="19"/>
                 <w:szCs w:val="19"/>
               </w:rPr>
-              <w:t xml:space="preserve">API: FAILED. Same period label is blocked ("The period label has already been taken."), but a second Octogenarian Grant with a different period label was ACCEPTED (HTTP 201). Duplicates are only checked per period label, not per one-time program.</w:t>
+              <w:t xml:space="preserve">Re-test after fix: a second Octogenarian Grant with a different period label is refused (HTTP 422) – "This senior already has this one-time grant on record." A failed attempt can still be retried. Originally failed – duplicates were only checked per period label.</w:t>
             </w:r>
           </w:p>
         </w:tc>
@@ -9659,7 +9659,7 @@
               <w:bottom w:val="single" w:color="9AA5B1" w:sz="4"/>
               <w:right w:val="single" w:color="9AA5B1" w:sz="4"/>
             </w:tcBorders>
-            <w:shd w:fill="F8D7DA" w:color="auto" w:val="clear"/>
+            <w:shd w:fill="E2F0D9" w:color="auto" w:val="clear"/>
             <w:tcMar>
               <w:top w:type="dxa" w:w="70"/>
               <w:left w:type="dxa" w:w="100"/>
@@ -9677,11 +9677,11 @@
                 <w:rFonts w:ascii="Calibri" w:cs="Calibri" w:eastAsia="Calibri" w:hAnsi="Calibri"/>
                 <w:b/>
                 <w:bCs/>
-                <w:color w:val="9C1C28"/>
-                <w:sz w:val="19"/>
-                <w:szCs w:val="19"/>
-              </w:rPr>
-              <w:t xml:space="preserve">Fail</w:t>
+                <w:color w:val="2E6B1F"/>
+                <w:sz w:val="19"/>
+                <w:szCs w:val="19"/>
+              </w:rPr>
+              <w:t xml:space="preserve">Pass</w:t>
             </w:r>
           </w:p>
         </w:tc>
@@ -10806,38 +10806,38 @@
                 <w:sz w:val="19"/>
                 <w:szCs w:val="19"/>
               </w:rPr>
-              <w:t xml:space="preserve">As Admin, open Reports and generate a report.</w:t>
-            </w:r>
-          </w:p>
-        </w:tc>
-        <w:tc>
-          <w:tcPr>
-            <w:tcW w:type="dxa" w:w="3300"/>
-            <w:tcBorders>
-              <w:top w:val="single" w:color="9AA5B1" w:sz="4"/>
-              <w:left w:val="single" w:color="9AA5B1" w:sz="4"/>
-              <w:bottom w:val="single" w:color="9AA5B1" w:sz="4"/>
-              <w:right w:val="single" w:color="9AA5B1" w:sz="4"/>
-            </w:tcBorders>
-            <w:tcMar>
-              <w:top w:type="dxa" w:w="70"/>
-              <w:left w:type="dxa" w:w="100"/>
-              <w:bottom w:type="dxa" w:w="70"/>
-              <w:right w:type="dxa" w:w="100"/>
-            </w:tcMar>
-            <w:vAlign w:val="top"/>
-          </w:tcPr>
-          <w:p>
-            <w:pPr>
-              <w:keepNext w:val="false"/>
-            </w:pPr>
-            <w:r>
-              <w:rPr>
-                <w:rFonts w:ascii="Calibri" w:cs="Calibri" w:eastAsia="Calibri" w:hAnsi="Calibri"/>
-                <w:sz w:val="19"/>
-                <w:szCs w:val="19"/>
-              </w:rPr>
-              <w:t xml:space="preserve">Report draft is created with current data.</w:t>
+              <w:t xml:space="preserve">As Admin, open Reports and click Generate report.</w:t>
+            </w:r>
+          </w:p>
+        </w:tc>
+        <w:tc>
+          <w:tcPr>
+            <w:tcW w:type="dxa" w:w="3300"/>
+            <w:tcBorders>
+              <w:top w:val="single" w:color="9AA5B1" w:sz="4"/>
+              <w:left w:val="single" w:color="9AA5B1" w:sz="4"/>
+              <w:bottom w:val="single" w:color="9AA5B1" w:sz="4"/>
+              <w:right w:val="single" w:color="9AA5B1" w:sz="4"/>
+            </w:tcBorders>
+            <w:tcMar>
+              <w:top w:type="dxa" w:w="70"/>
+              <w:left w:type="dxa" w:w="100"/>
+              <w:bottom w:type="dxa" w:w="70"/>
+              <w:right w:type="dxa" w:w="100"/>
+            </w:tcMar>
+            <w:vAlign w:val="top"/>
+          </w:tcPr>
+          <w:p>
+            <w:pPr>
+              <w:keepNext w:val="false"/>
+            </w:pPr>
+            <w:r>
+              <w:rPr>
+                <w:rFonts w:ascii="Calibri" w:cs="Calibri" w:eastAsia="Calibri" w:hAnsi="Calibri"/>
+                <w:sz w:val="19"/>
+                <w:szCs w:val="19"/>
+              </w:rPr>
+              <w:t xml:space="preserve">A Draft report is saved with current data and the Head is notified.</w:t>
             </w:r>
           </w:p>
         </w:tc>
@@ -10939,69 +10939,69 @@
                 <w:sz w:val="19"/>
                 <w:szCs w:val="19"/>
               </w:rPr>
-              <w:t xml:space="preserve">TC-061  Approve a report</w:t>
-            </w:r>
-          </w:p>
-        </w:tc>
-        <w:tc>
-          <w:tcPr>
-            <w:tcW w:type="dxa" w:w="3300"/>
-            <w:tcBorders>
-              <w:top w:val="single" w:color="9AA5B1" w:sz="4"/>
-              <w:left w:val="single" w:color="9AA5B1" w:sz="4"/>
-              <w:bottom w:val="single" w:color="9AA5B1" w:sz="4"/>
-              <w:right w:val="single" w:color="9AA5B1" w:sz="4"/>
-            </w:tcBorders>
-            <w:tcMar>
-              <w:top w:type="dxa" w:w="70"/>
-              <w:left w:type="dxa" w:w="100"/>
-              <w:bottom w:type="dxa" w:w="70"/>
-              <w:right w:type="dxa" w:w="100"/>
-            </w:tcMar>
-            <w:vAlign w:val="top"/>
-          </w:tcPr>
-          <w:p>
-            <w:pPr>
-              <w:keepNext w:val="false"/>
-            </w:pPr>
-            <w:r>
-              <w:rPr>
-                <w:rFonts w:ascii="Calibri" w:cs="Calibri" w:eastAsia="Calibri" w:hAnsi="Calibri"/>
-                <w:sz w:val="19"/>
-                <w:szCs w:val="19"/>
-              </w:rPr>
-              <w:t xml:space="preserve">As Head, open the draft report and approve it.</w:t>
-            </w:r>
-          </w:p>
-        </w:tc>
-        <w:tc>
-          <w:tcPr>
-            <w:tcW w:type="dxa" w:w="3300"/>
-            <w:tcBorders>
-              <w:top w:val="single" w:color="9AA5B1" w:sz="4"/>
-              <w:left w:val="single" w:color="9AA5B1" w:sz="4"/>
-              <w:bottom w:val="single" w:color="9AA5B1" w:sz="4"/>
-              <w:right w:val="single" w:color="9AA5B1" w:sz="4"/>
-            </w:tcBorders>
-            <w:tcMar>
-              <w:top w:type="dxa" w:w="70"/>
-              <w:left w:type="dxa" w:w="100"/>
-              <w:bottom w:type="dxa" w:w="70"/>
-              <w:right w:type="dxa" w:w="100"/>
-            </w:tcMar>
-            <w:vAlign w:val="top"/>
-          </w:tcPr>
-          <w:p>
-            <w:pPr>
-              <w:keepNext w:val="false"/>
-            </w:pPr>
-            <w:r>
-              <w:rPr>
-                <w:rFonts w:ascii="Calibri" w:cs="Calibri" w:eastAsia="Calibri" w:hAnsi="Calibri"/>
-                <w:sz w:val="19"/>
-                <w:szCs w:val="19"/>
-              </w:rPr>
-              <w:t xml:space="preserve">Report status becomes Approved and it can be published or exported.</w:t>
+              <w:t xml:space="preserve">TC-061  Approve and publish a report</w:t>
+            </w:r>
+          </w:p>
+        </w:tc>
+        <w:tc>
+          <w:tcPr>
+            <w:tcW w:type="dxa" w:w="3300"/>
+            <w:tcBorders>
+              <w:top w:val="single" w:color="9AA5B1" w:sz="4"/>
+              <w:left w:val="single" w:color="9AA5B1" w:sz="4"/>
+              <w:bottom w:val="single" w:color="9AA5B1" w:sz="4"/>
+              <w:right w:val="single" w:color="9AA5B1" w:sz="4"/>
+            </w:tcBorders>
+            <w:tcMar>
+              <w:top w:type="dxa" w:w="70"/>
+              <w:left w:type="dxa" w:w="100"/>
+              <w:bottom w:type="dxa" w:w="70"/>
+              <w:right w:type="dxa" w:w="100"/>
+            </w:tcMar>
+            <w:vAlign w:val="top"/>
+          </w:tcPr>
+          <w:p>
+            <w:pPr>
+              <w:keepNext w:val="false"/>
+            </w:pPr>
+            <w:r>
+              <w:rPr>
+                <w:rFonts w:ascii="Calibri" w:cs="Calibri" w:eastAsia="Calibri" w:hAnsi="Calibri"/>
+                <w:sz w:val="19"/>
+                <w:szCs w:val="19"/>
+              </w:rPr>
+              <w:t xml:space="preserve">As Head, click Approve on the Draft report; then as Admin, click Publish.</w:t>
+            </w:r>
+          </w:p>
+        </w:tc>
+        <w:tc>
+          <w:tcPr>
+            <w:tcW w:type="dxa" w:w="3300"/>
+            <w:tcBorders>
+              <w:top w:val="single" w:color="9AA5B1" w:sz="4"/>
+              <w:left w:val="single" w:color="9AA5B1" w:sz="4"/>
+              <w:bottom w:val="single" w:color="9AA5B1" w:sz="4"/>
+              <w:right w:val="single" w:color="9AA5B1" w:sz="4"/>
+            </w:tcBorders>
+            <w:tcMar>
+              <w:top w:type="dxa" w:w="70"/>
+              <w:left w:type="dxa" w:w="100"/>
+              <w:bottom w:type="dxa" w:w="70"/>
+              <w:right w:type="dxa" w:w="100"/>
+            </w:tcMar>
+            <w:vAlign w:val="top"/>
+          </w:tcPr>
+          <w:p>
+            <w:pPr>
+              <w:keepNext w:val="false"/>
+            </w:pPr>
+            <w:r>
+              <w:rPr>
+                <w:rFonts w:ascii="Calibri" w:cs="Calibri" w:eastAsia="Calibri" w:hAnsi="Calibri"/>
+                <w:sz w:val="19"/>
+                <w:szCs w:val="19"/>
+              </w:rPr>
+              <w:t xml:space="preserve">Status changes Draft → Approved → Published; the approver's name is shown.</w:t>
             </w:r>
           </w:p>
         </w:tc>
@@ -11032,7 +11032,7 @@
                 <w:sz w:val="19"/>
                 <w:szCs w:val="19"/>
               </w:rPr>
-              <w:t xml:space="preserve">Code: FAILED. No approval feature exists. The report list (Draft/Approved/Published) is fixed sample data in reports.tsx and there is no Approve button or backend endpoint.</w:t>
+              <w:t xml:space="preserve">Re-test after fix (browser): Admin's Generate report saved a Draft and notified the Head; Head clicked Approve → Approved, with "Approved by &lt;Head&gt;" shown; Admin clicked Publish → Published. Originally failed – the report list was fixed sample data with no approval.</w:t>
             </w:r>
           </w:p>
         </w:tc>
@@ -11045,7 +11045,7 @@
               <w:bottom w:val="single" w:color="9AA5B1" w:sz="4"/>
               <w:right w:val="single" w:color="9AA5B1" w:sz="4"/>
             </w:tcBorders>
-            <w:shd w:fill="F8D7DA" w:color="auto" w:val="clear"/>
+            <w:shd w:fill="E2F0D9" w:color="auto" w:val="clear"/>
             <w:tcMar>
               <w:top w:type="dxa" w:w="70"/>
               <w:left w:type="dxa" w:w="100"/>
@@ -11063,11 +11063,11 @@
                 <w:rFonts w:ascii="Calibri" w:cs="Calibri" w:eastAsia="Calibri" w:hAnsi="Calibri"/>
                 <w:b/>
                 <w:bCs/>
-                <w:color w:val="9C1C28"/>
-                <w:sz w:val="19"/>
-                <w:szCs w:val="19"/>
-              </w:rPr>
-              <w:t xml:space="preserve">Fail</w:t>
+                <w:color w:val="2E6B1F"/>
+                <w:sz w:val="19"/>
+                <w:szCs w:val="19"/>
+              </w:rPr>
+              <w:t xml:space="preserve">Pass</w:t>
             </w:r>
           </w:p>
         </w:tc>
@@ -11561,7 +11561,7 @@
                 <w:sz w:val="19"/>
                 <w:szCs w:val="19"/>
               </w:rPr>
-              <w:t xml:space="preserve">Code: FAILED. Text replies work, but the Add attachment, Add photo, and Add emoji buttons have no action attached (messages.tsx) and the API accepts text only.</w:t>
+              <w:t xml:space="preserve">Re-test after fix (browser): a photo with text and emoji 👍, and a PDF, were sent and appear in the conversation for both users (photo inline, file as a download link). Limit 5 MB; PDF, images, Word, Excel. Originally failed – the buttons did nothing.</w:t>
             </w:r>
           </w:p>
         </w:tc>
@@ -11574,7 +11574,7 @@
               <w:bottom w:val="single" w:color="9AA5B1" w:sz="4"/>
               <w:right w:val="single" w:color="9AA5B1" w:sz="4"/>
             </w:tcBorders>
-            <w:shd w:fill="F8D7DA" w:color="auto" w:val="clear"/>
+            <w:shd w:fill="E2F0D9" w:color="auto" w:val="clear"/>
             <w:tcMar>
               <w:top w:type="dxa" w:w="70"/>
               <w:left w:type="dxa" w:w="100"/>
@@ -11592,11 +11592,11 @@
                 <w:rFonts w:ascii="Calibri" w:cs="Calibri" w:eastAsia="Calibri" w:hAnsi="Calibri"/>
                 <w:b/>
                 <w:bCs/>
-                <w:color w:val="9C1C28"/>
-                <w:sz w:val="19"/>
-                <w:szCs w:val="19"/>
-              </w:rPr>
-              <w:t xml:space="preserve">Fail</w:t>
+                <w:color w:val="2E6B1F"/>
+                <w:sz w:val="19"/>
+                <w:szCs w:val="19"/>
+              </w:rPr>
+              <w:t xml:space="preserve">Pass</w:t>
             </w:r>
           </w:p>
         </w:tc>
@@ -15785,7 +15785,7 @@
           <w:sz w:val="21"/>
           <w:szCs w:val="21"/>
         </w:rPr>
-        <w:t xml:space="preserve">Summary – Total test cases: 88    Passed: 81    Failed: 4    Not Run: 3</w:t>
+        <w:t xml:space="preserve">Summary – Total test cases: 88    Passed: 85    Failed: 0    Not Run: 3</w:t>
       </w:r>
     </w:p>
     <w:p>
@@ -15798,7 +15798,7 @@
           <w:sz w:val="20"/>
           <w:szCs w:val="20"/>
         </w:rPr>
-        <w:t xml:space="preserve">Failed: TC-043 (edit request approval), TC-053 (duplicate one-time grant), TC-061 (report approval), TC-064 (chat attachments/photo/emoji).</w:t>
+        <w:t xml:space="preserve">TC-043, TC-053, TC-061, and TC-064 failed in the first run and pass after the fixes made on October 8, 2026 (re-test notes are in each row).</w:t>
       </w:r>
     </w:p>
     <w:p>

</xml_diff>